<commit_message>
Audit script_2 against notebook cell order and fix Chat answer attribution
Full pass over script_2 mirroring the script_1 audit: fix four
cell-order violations found by comparing the script against the
notebook's actual cell sequence (the model diagram was narrated after
the priors Chat question instead of before it; the 3-panel posterior
plot was described after the "side by side" section header instead
of before it; the MixedLM summary output, groups/method/coefficients,
was narrated after the mixed-effects Chat question instead of before
it; the divergence-count comparison was narrated after the
centered-vs-non-centered Chat question instead of before it). Also
fix a factual misattribution: the notebook's Chat question comparing
three slope estimates has no verbal answer at all, only code, but the
script presented the resulting finding as if Chat had stated it
directly.

Co-Authored-By: Claude Sonnet 5 <noreply@anthropic.com>
</commit_message>
<xml_diff>
--- a/2_bayes_vs_ols_tips/script_2_bayes_vs_ols.docx
+++ b/2_bayes_vs_ols_tips/script_2_bayes_vs_ols.docx
@@ -403,7 +403,7 @@
           <w:sz w:val="25"/>
           <w:rtl/>
         </w:rPr>
-        <w:t>עכשיו לאותו מודל בדיוק, בגישה הבייסאנית, ב-PyMC, וצריך לבחור פריורים. שאלתי את הצ'אט למה הבחירות שלי סבירות:</w:t>
+        <w:t>עכשיו לאותו מודל בדיוק, בגישה הבייסאנית, ב-PyMC, וצריך לבחור פריורים. לפני שדוגמים בפועל, יש כאן דיאגרמה גרפית של מבנה המודל: סיגמא, החיתוך והשיפוע מופיעים כעיגולים פתוחים, כי הם נסתרים ולא ידועים, וכולם מזינים חץ לתוך הטיפ, שמופיע כעיגול מוצל כי הוא נצפה, יש לנו את הנתונים בפועל. שאלתי את הצ'אט למה הבחירות שלי לפריורים סבירות:</w:t>
       </w:r>
     </w:p>
     <w:p>
@@ -489,7 +489,7 @@
           <w:sz w:val="25"/>
           <w:rtl/>
         </w:rPr>
-        <w:t>לפני שדוגמים בפועל, יש כאן דיאגרמה גרפית של מבנה המודל: סיגמא, החיתוך והשיפוע מופיעים כעיגולים פתוחים, כי הם נסתרים ולא ידועים, וכולם מזינים חץ לתוך הטיפ, שמופיע כעיגול מוצל כי הוא נצפה, יש לנו את הנתונים בפועל.</w:t>
+        <w:t>אחרי הדגימה, הפוסטריורי מוצג בשלושה פאנלים נפרדים, אחד לכל פרמטר, חיתוך, שיפוע וסיגמא: בכל פאנל ציר ה-X הוא הערך האפשרי של הפרמטר וציר ה-Y הוא צפיפות ההסתברות, עם עקומה שמראה כמה סביר כל ערך, קו שמסמן את אומדן הנקודה, ותחום מוצלל שמסמן את רווח האמון.</w:t>
       </w:r>
     </w:p>
     <w:p>
@@ -507,23 +507,6 @@
           <w:rtl/>
         </w:rPr>
         <w:t>השוואה ישירה בין OLS לבייסאני</w:t>
-      </w:r>
-    </w:p>
-    <w:p>
-      <w:pPr>
-        <w:bidi/>
-        <w:spacing w:after="160" w:before="0"/>
-        <w:jc w:val="both"/>
-      </w:pPr>
-      <w:r>
-        <w:rPr>
-          <w:rFonts w:ascii="David" w:hAnsi="David" w:cs="David" w:eastAsia="David"/>
-          <w:b w:val="0"/>
-          <w:i w:val="0"/>
-          <w:sz w:val="25"/>
-          <w:rtl/>
-        </w:rPr>
-        <w:t>עכשיו אפשר להשוות ישירות בין שתי הגישות. הפוסטריורי מוצג בשלושה פאנלים נפרדים, אחד לכל פרמטר, חיתוך, שיפוע וסיגמא: בכל פאנל ציר ה-X הוא הערך האפשרי של הפרמטר וציר ה-Y הוא צפיפות ההסתברות, עם עקומה שמראה כמה סביר כל ערך, קו שמסמן את אומדן הנקודה, ותחום מוצלל שמסמן את רווח האמון.</w:t>
       </w:r>
     </w:p>
     <w:p>
@@ -775,7 +758,41 @@
           <w:sz w:val="25"/>
           <w:rtl/>
         </w:rPr>
-        <w:t>עכשיו לשאלה המרכזית של המחברת הזו: האם הקשר בין חשבון לטיפ שונה בין הימים, במיוחד ביום שישי, שיש לו רק תשע-עשרה תצפיות, הרבה פחות מהימים האחרים. בודקת את זה קודם בדרך הקלאסית, עם מודל אפקטים מעורבים. שאלתי את הצ'אט מה זה בעצם, ואיך הוא קשור למודל ההיררכי הבייסאני:</w:t>
+        <w:t>עכשיו לשאלה המרכזית של המחברת הזו: האם הקשר בין חשבון לטיפ שונה בין הימים, במיוחד ביום שישי, שיש לו רק תשע-עשרה תצפיות, הרבה פחות מהימים האחרים. בודקת את זה קודם בדרך הקלאסית, עם מודל אפקטים מעורבים.</w:t>
+      </w:r>
+    </w:p>
+    <w:p>
+      <w:pPr>
+        <w:bidi/>
+        <w:spacing w:after="160" w:before="0"/>
+        <w:jc w:val="both"/>
+      </w:pPr>
+      <w:r>
+        <w:rPr>
+          <w:rFonts w:ascii="David" w:hAnsi="David" w:cs="David" w:eastAsia="David"/>
+          <w:b w:val="0"/>
+          <w:i w:val="0"/>
+          <w:sz w:val="25"/>
+          <w:rtl/>
+        </w:rPr>
+        <w:t>בפלט של המודל הזה יש כמה שורות שכדאי לפרק. מספר הקבוצות הוא ארבע, כמספר הימים. שיטת האמידה שכתובה שם היא נראות מוגבלת, שהיא וריאציה על נראות מרבית המיועדת במיוחד לאמידת רכיבי שונות: נראות מרבית רגילה נוטה להעריך שונות בין-קבוצתית בחסר כשיש מעט קבוצות, והשיטה הזו מתקנת את ההטיה הזאת. כשהרצתי את זה קפצה אזהרת אי-התכנסות אמיתית, וכדאי לספר עליה בקול ולא להסתיר: עם רק ארבע קבוצות, לאלגוריתם יש מעט מאוד מידע כדי לקבוע את מבנה השונות ביניהן, וזה מוכר. השתמשתי בתוצאה בכל זאת, כי ניסיון חוזר עם שיטת אופטימיזציה אחרת כן התכנס לתשובה סבירה. בטבלת המקדמים עצמה, מקדם החיתוך יצא סביב 0.95 עם מובהקות גבוהה, ומקדם סכום החשבון יצא סביב 0.104, קרוב מאוד למה שקיבלנו ב-OLS הרגיל. השונות בין הימים עצמם, שמופיעה בשורה נפרדת, נותנת מושג כמה הימים שונים זה מזה.</w:t>
+      </w:r>
+    </w:p>
+    <w:p>
+      <w:pPr>
+        <w:bidi/>
+        <w:spacing w:after="160" w:before="0"/>
+        <w:jc w:val="both"/>
+      </w:pPr>
+      <w:r>
+        <w:rPr>
+          <w:rFonts w:ascii="David" w:hAnsi="David" w:cs="David" w:eastAsia="David"/>
+          <w:b w:val="0"/>
+          <w:i w:val="0"/>
+          <w:sz w:val="25"/>
+          <w:rtl/>
+        </w:rPr>
+        <w:t>שאלתי את הצ'אט מה זה בעצם מודל כזה, ואיך הוא קשור למודל ההיררכי הבייסאני:</w:t>
       </w:r>
     </w:p>
     <w:p>
@@ -825,24 +842,7 @@
           <w:sz w:val="25"/>
           <w:rtl/>
         </w:rPr>
-        <w:t>בפלט של המודל הזה יש כמה שורות שכדאי לפרק. מספר הקבוצות הוא ארבע, כמספר הימים. שיטת האמידה שכתובה שם היא נראות מוגבלת, שהיא וריאציה על נראות מרבית המיועדת במיוחד לאמידת רכיבי שונות: נראות מרבית רגילה נוטה להעריך שונות בין-קבוצתית בחסר כשיש מעט קבוצות, והשיטה הזו מתקנת את ההטיה הזאת. כשהרצתי את זה קפצה אזהרת אי-התכנסות אמיתית, וכדאי לספר עליה בקול ולא להסתיר: עם רק ארבע קבוצות, לאלגוריתם יש מעט מאוד מידע כדי לקבוע את מבנה השונות ביניהן, וזה מוכר. השתמשתי בתוצאה בכל זאת, כי ניסיון חוזר עם שיטת אופטימיזציה אחרת כן התכנס לתשובה סבירה.</w:t>
-      </w:r>
-    </w:p>
-    <w:p>
-      <w:pPr>
-        <w:bidi/>
-        <w:spacing w:after="160" w:before="0"/>
-        <w:jc w:val="both"/>
-      </w:pPr>
-      <w:r>
-        <w:rPr>
-          <w:rFonts w:ascii="David" w:hAnsi="David" w:cs="David" w:eastAsia="David"/>
-          <w:b w:val="0"/>
-          <w:i w:val="0"/>
-          <w:sz w:val="25"/>
-          <w:rtl/>
-        </w:rPr>
-        <w:t>בטבלת המקדמים עצמה, מקדם החיתוך יצא סביב 0.95 עם מובהקות גבוהה, ומקדם סכום החשבון יצא סביב 0.104, קרוב מאוד למה שקיבלנו ב-OLS הרגיל. השונות בין הימים עצמם, שמופיעה בשורה נפרדת, נותנת מושג כמה הימים שונים זה מזה. האומדן הנקודתי לכל יום ספציפי נקרא הטוב ביותר בין האומדנים חסרי ההטיה, ובקיצור באנגלית BLUP. בטבלה שלו: יום שישי יוצא עם סטייה קטנה מהממוצע, ואילו יום ראשון יוצא עם הסטייה הגדולה ביותר.</w:t>
+        <w:t>האומדן הנקודתי לכל יום ספציפי נקרא הטוב ביותר בין האומדנים חסרי ההטיה, ובקיצור באנגלית BLUP. בטבלה שלו: יום שישי יוצא עם סטייה קטנה מהממוצע, ואילו יום ראשון יוצא עם הסטייה הגדולה ביותר.</w:t>
       </w:r>
     </w:p>
     <w:p>
@@ -1129,7 +1129,41 @@
           <w:sz w:val="25"/>
           <w:rtl/>
         </w:rPr>
-        <w:t>הפתרון למשפך הוא לשנות איך מייצגים את הפרמטר. שאלתי את הצ'אט מה בדיוק ההבדל מהמודל הממורכז, ואיפה ראיתי טריק דומה בעבר:</w:t>
+        <w:t>הפתרון למשפך הוא לשנות איך מייצגים את הפרמטר.</w:t>
+      </w:r>
+    </w:p>
+    <w:p>
+      <w:pPr>
+        <w:bidi/>
+        <w:spacing w:after="160" w:before="0"/>
+        <w:jc w:val="both"/>
+      </w:pPr>
+      <w:r>
+        <w:rPr>
+          <w:rFonts w:ascii="David" w:hAnsi="David" w:cs="David" w:eastAsia="David"/>
+          <w:b w:val="0"/>
+          <w:i w:val="0"/>
+          <w:sz w:val="25"/>
+          <w:rtl/>
+        </w:rPr>
+        <w:t>רגע כנות שחשוב לספר עליו, כי הוא בדיוק הדגמה של לבדוק תשובה ולא לקחת אותה כמובנת מאליה: הריצה הראשונה שלי, לפני מירכוז ה-X, הראתה בכלל לא שיפור דרמטי, כמעט אותו מספר דיברגנסים בשני המודלים. זה היה אמור להדאיג, כי ההסבר של משפך Neal מנבא שיפור גדול. חקרתי את זה במקום להתעלם, ומצאתי בעיה נפרדת ומקבילה: לא מירכזתי את משתנה ה-X עצמו, מה שיוצר בדיוק את בעיית הקורלציה המלאכותית בין החיתוך לשיפוע שהזכרתי קודם, והיא פוגעת בשני המודלים באותה מידה, ובכך מסתירה את התועלת האמיתית של תיקון המשפך. אחרי שמירכזתי את ה-X, קיבלתי את התוצאה האמיתית: מהמודל הממורכז לבדו, עם כ-463 דיברגנסים, למודל הלא-ממורכז, עם 10 בלבד, שיפור דרמטי ואמיתי, בדיוק כמו שהתאוריה חוזה.</w:t>
+      </w:r>
+    </w:p>
+    <w:p>
+      <w:pPr>
+        <w:bidi/>
+        <w:spacing w:after="160" w:before="0"/>
+        <w:jc w:val="both"/>
+      </w:pPr>
+      <w:r>
+        <w:rPr>
+          <w:rFonts w:ascii="David" w:hAnsi="David" w:cs="David" w:eastAsia="David"/>
+          <w:b w:val="0"/>
+          <w:i w:val="0"/>
+          <w:sz w:val="25"/>
+          <w:rtl/>
+        </w:rPr>
+        <w:t>שאלתי את הצ'אט מה בדיוק ההבדל מהמודל הממורכז, ואיפה ראיתי טריק דומה בעבר:</w:t>
       </w:r>
     </w:p>
     <w:p>
@@ -1163,23 +1197,6 @@
           <w:rtl/>
         </w:rPr>
         <w:t>והוא ענה שבמקום להצהיר על השיפוע של כל יום ישירות כנשלף מהתפלגות משותפת, מצהירים על משתנה סטנדרטי בסקאלה קבועה, ובונים את השיפוע בפועל כפעולה דטרמיניסטית: ממוצע משותף, ועוד המשתנה הסטנדרטי כפול סטיית התקן המשותפת. זו בדיוק אותה טריקה שמשמשת ב-Variational Autoencoders בלמידה עמוקה, אותה אלגברה בדיוק, רק ששם המטרה היא לאפשר גרדיאנטים לזרום דרך פעולת דגימה, וכאן המטרה היא לפשט את הגיאומטריה שהאלגוריתם צריך לחקור.</w:t>
-      </w:r>
-    </w:p>
-    <w:p>
-      <w:pPr>
-        <w:bidi/>
-        <w:spacing w:after="160" w:before="0"/>
-        <w:jc w:val="both"/>
-      </w:pPr>
-      <w:r>
-        <w:rPr>
-          <w:rFonts w:ascii="David" w:hAnsi="David" w:cs="David" w:eastAsia="David"/>
-          <w:b w:val="0"/>
-          <w:i w:val="0"/>
-          <w:sz w:val="25"/>
-          <w:rtl/>
-        </w:rPr>
-        <w:t>רגע כנות שחשוב לספר עליו, כי הוא בדיוק הדגמה של לבדוק תשובה ולא לקחת אותה כמובנת מאליה: הריצה הראשונה שלי, לפני מירכוז ה-X, הראתה בכלל לא שיפור דרמטי, כמעט אותו מספר דיברגנסים בשני המודלים. זה היה אמור להדאיג, כי ההסבר של משפך Neal מנבא שיפור גדול. חקרתי את זה במקום להתעלם, ומצאתי בעיה נפרדת ומקבילה: לא מירכזתי את משתנה ה-X עצמו, מה שיוצר בדיוק את בעיית הקורלציה המלאכותית בין החיתוך לשיפוע שהזכרתי קודם, והיא פוגעת בשני המודלים באותה מידה, ובכך מסתירה את התועלת האמיתית של תיקון המשפך. אחרי שמירכזתי את ה-X, קיבלתי את התוצאה האמיתית: מהמודל הממורכז לבדו, עם כ-463 דיברגנסים, למודל הלא-ממורכז, עם 10 בלבד, שיפור דרמטי ואמיתי, בדיוק כמו שהתאוריה חוזה.</w:t>
       </w:r>
     </w:p>
     <w:p>
@@ -1246,7 +1263,7 @@
           <w:sz w:val="25"/>
           <w:rtl/>
         </w:rPr>
-        <w:t>והוא ענה שאכן כן, ובאותו כיוון: יום שישי, הקבוצה הכי קטנה, אמור לזוז הכי הרבה מהאומדן הנפרד לכיוון הממוצע המשותף גם ב-BLUP של MixedLM וגם בממוצע הפוסטריורי הבייסאני, כי שתי השיטות מיישמות את אותו רעיון של איחוד חלקי, פשוט דרך מנגנון סטטיסטי שונה: אחת ממקסמת נראות והשנייה דוגמת פוסטריורי.</w:t>
+        <w:t>הצ'אט לא ענה במילים הפעם, אלא הציע קוד שבונה טבלת השוואה בין שלושת השיפועים לכל יום, ביחד עם גרף שממחיש אותה. כשהרצתי את זה, אכן יצא ששלושת השיטות מסכימות על הכיוון: יום שישי, הקבוצה הכי קטנה, זז הכי הרבה מהאומדן הנפרד לכיוון הממוצע המשותף גם ב-BLUP של MixedLM וגם בממוצע הפוסטריורי הבייסאני, כי שתי השיטות מיישמות את אותו רעיון של איחוד חלקי, פשוט דרך מנגנון סטטיסטי שונה: אחת ממקסמת נראות והשנייה דוגמת פוסטריורי.</w:t>
       </w:r>
     </w:p>
     <w:p>

</xml_diff>